<commit_message>
Updating homeworks 10 and 11, lectures 9-13
</commit_message>
<xml_diff>
--- a/homework/hw-10_MH.docx
+++ b/homework/hw-10_MH.docx
@@ -377,7 +377,7 @@
         <w:t xml:space="preserve">licorice_bin</w:t>
       </w:r>
       <w:r>
-        <w:t xml:space="preserve">. No need to print anything here, just show the code. (Hint: Refer back to Lab 3 for examples of</w:t>
+        <w:t xml:space="preserve">. No need to print anything here, just show the code. (Hint: Refer back to Lab 2 for examples of</w:t>
       </w:r>
       <w:r>
         <w:t xml:space="preserve"> </w:t>
@@ -590,7 +590,23 @@
         <w:t xml:space="preserve"> </w:t>
       </w:r>
       <w:r>
-        <w:t xml:space="preserve">in your newly created binary variable), given an ASA classification of</w:t>
+        <w:t xml:space="preserve">in your newly created binary variable) and the expected count of</w:t>
+      </w:r>
+      <w:r>
+        <w:t xml:space="preserve"> </w:t>
+      </w:r>
+      <w:r>
+        <w:rPr>
+          <w:b/>
+          <w:bCs/>
+        </w:rPr>
+        <w:t xml:space="preserve">not</w:t>
+      </w:r>
+      <w:r>
+        <w:t xml:space="preserve"> </w:t>
+      </w:r>
+      <w:r>
+        <w:t xml:space="preserve">having throat pain 30 minutes after surgery, given an ASA classification of</w:t>
       </w:r>
       <w:r>
         <w:t xml:space="preserve"> </w:t>
@@ -723,17 +739,6 @@
         <w:t xml:space="preserve">Write a 1-sentence conclusion.</w:t>
       </w:r>
     </w:p>
-    <w:p>
-      <w:pPr>
-        <w:numPr>
-          <w:ilvl w:val="0"/>
-          <w:numId w:val="1003"/>
-        </w:numPr>
-      </w:pPr>
-      <w:r>
-        <w:t xml:space="preserve">State 1 reason why (in general) one might choose to use a Fisher Exact Test rather than a chi-square test.</w:t>
-      </w:r>
-    </w:p>
     <w:bookmarkEnd w:id="13"/>
     <w:bookmarkStart w:id="14" w:name="exercise-2"/>
     <w:p>
@@ -753,13 +758,13 @@
       </w:r>
     </w:p>
     <w:bookmarkEnd w:id="14"/>
-    <w:bookmarkStart w:id="15" w:name="cereal"/>
+    <w:bookmarkStart w:id="15" w:name="ai-attestation"/>
     <w:p>
       <w:pPr>
         <w:pStyle w:val="Heading2"/>
       </w:pPr>
       <w:r>
-        <w:t xml:space="preserve">Cereal</w:t>
+        <w:t xml:space="preserve">AI Attestation</w:t>
       </w:r>
     </w:p>
     <w:p>
@@ -767,22 +772,63 @@
         <w:pStyle w:val="FirstParagraph"/>
       </w:pPr>
       <w:r>
-        <w:t xml:space="preserve">The file</w:t>
-      </w:r>
-      <w:r>
-        <w:t xml:space="preserve"> </w:t>
-      </w:r>
-      <w:r>
-        <w:rPr>
-          <w:rStyle w:val="VerbatimChar"/>
-        </w:rPr>
-        <w:t xml:space="preserve">cereals.csv</w:t>
-      </w:r>
-      <w:r>
-        <w:t xml:space="preserve"> </w:t>
-      </w:r>
-      <w:r>
-        <w:t xml:space="preserve">contains data for 77 breakfast cereals in terms of their nutritional content per serving and other characteristics. The variables are:</w:t>
+        <w:t xml:space="preserve">Was AI used on this assignment? If so, describe your prompts below. If not, simply state</w:t>
+      </w:r>
+      <w:r>
+        <w:t xml:space="preserve"> </w:t>
+      </w:r>
+      <w:r>
+        <w:t xml:space="preserve">“AI was not used on this assignment.”</w:t>
+      </w:r>
+    </w:p>
+    <w:bookmarkEnd w:id="15"/>
+    <w:bookmarkStart w:id="16" w:name="submission"/>
+    <w:p>
+      <w:pPr>
+        <w:pStyle w:val="Heading2"/>
+      </w:pPr>
+      <w:r>
+        <w:t xml:space="preserve">Submission</w:t>
+      </w:r>
+    </w:p>
+    <w:p>
+      <w:pPr>
+        <w:pStyle w:val="FirstParagraph"/>
+      </w:pPr>
+      <w:r>
+        <w:t xml:space="preserve">As you’ve seen previously, we can</w:t>
+      </w:r>
+      <w:r>
+        <w:t xml:space="preserve"> </w:t>
+      </w:r>
+      <w:r>
+        <w:rPr>
+          <w:b/>
+          <w:bCs/>
+        </w:rPr>
+        <w:t xml:space="preserve">Render</w:t>
+      </w:r>
+      <w:r>
+        <w:t xml:space="preserve"> </w:t>
+      </w:r>
+      <w:r>
+        <w:t xml:space="preserve">into an .html file that can be opened by any web browser. To export it as a .pdf, open the file in your web browser and then print to or save as a .pdf document. Contact me in Ed Discussion if you need help!</w:t>
+      </w:r>
+    </w:p>
+    <w:p>
+      <w:pPr>
+        <w:pStyle w:val="BodyText"/>
+      </w:pPr>
+      <w:r>
+        <w:t xml:space="preserve">You will submit the PDF documents for labs and homework to Gradescope as part of your final submission.</w:t>
+      </w:r>
+    </w:p>
+    <w:p>
+      <w:pPr>
+        <w:pStyle w:val="BodyText"/>
+      </w:pPr>
+      <w:r>
+        <w:t xml:space="preserve">To submit your assignment:</w:t>
       </w:r>
     </w:p>
     <w:p>
@@ -793,13 +839,7 @@
         </w:numPr>
       </w:pPr>
       <w:r>
-        <w:rPr>
-          <w:rStyle w:val="VerbatimChar"/>
-        </w:rPr>
-        <w:t xml:space="preserve">name</w:t>
-      </w:r>
-      <w:r>
-        <w:t xml:space="preserve">: name of the cereal</w:t>
+        <w:t xml:space="preserve">Access Gradescope through the menu on the BIOS 600 Canvas site.</w:t>
       </w:r>
     </w:p>
     <w:p>
@@ -810,13 +850,7 @@
         </w:numPr>
       </w:pPr>
       <w:r>
-        <w:rPr>
-          <w:rStyle w:val="VerbatimChar"/>
-        </w:rPr>
-        <w:t xml:space="preserve">mfr</w:t>
-      </w:r>
-      <w:r>
-        <w:t xml:space="preserve">: manufacturer (A: American Home Food Products, G: General Mills, K: Kellogg’s, N: Nabisco, P: Post, Q: Quaker Oats, and R: Ralston Purina)</w:t>
+        <w:t xml:space="preserve">Click on the assignment, and you’ll be prompted to submit it.</w:t>
       </w:r>
     </w:p>
     <w:p>
@@ -827,13 +861,7 @@
         </w:numPr>
       </w:pPr>
       <w:r>
-        <w:rPr>
-          <w:rStyle w:val="VerbatimChar"/>
-        </w:rPr>
-        <w:t xml:space="preserve">type</w:t>
-      </w:r>
-      <w:r>
-        <w:t xml:space="preserve">: cold vs. hot</w:t>
+        <w:t xml:space="preserve">Mark the pages associated with each exercise. All of the pages of your lab should be associated with at least one question (i.e., should be “checked”).</w:t>
       </w:r>
     </w:p>
     <w:p>
@@ -844,480 +872,23 @@
         </w:numPr>
       </w:pPr>
       <w:r>
-        <w:rPr>
-          <w:rStyle w:val="VerbatimChar"/>
-        </w:rPr>
-        <w:t xml:space="preserve">calories</w:t>
-      </w:r>
-      <w:r>
-        <w:t xml:space="preserve">,</w:t>
-      </w:r>
-      <w:r>
-        <w:t xml:space="preserve"> </w:t>
-      </w:r>
-      <w:r>
-        <w:rPr>
-          <w:rStyle w:val="VerbatimChar"/>
-        </w:rPr>
-        <w:t xml:space="preserve">protein</w:t>
-      </w:r>
-      <w:r>
-        <w:t xml:space="preserve">,</w:t>
-      </w:r>
-      <w:r>
-        <w:t xml:space="preserve"> </w:t>
-      </w:r>
-      <w:r>
-        <w:rPr>
-          <w:rStyle w:val="VerbatimChar"/>
-        </w:rPr>
-        <w:t xml:space="preserve">fat</w:t>
-      </w:r>
-      <w:r>
-        <w:t xml:space="preserve">,</w:t>
-      </w:r>
-      <w:r>
-        <w:t xml:space="preserve"> </w:t>
-      </w:r>
-      <w:r>
-        <w:rPr>
-          <w:rStyle w:val="VerbatimChar"/>
-        </w:rPr>
-        <w:t xml:space="preserve">sodium</w:t>
-      </w:r>
-      <w:r>
-        <w:t xml:space="preserve">,</w:t>
-      </w:r>
-      <w:r>
-        <w:t xml:space="preserve"> </w:t>
-      </w:r>
-      <w:r>
-        <w:rPr>
-          <w:rStyle w:val="VerbatimChar"/>
-        </w:rPr>
-        <w:t xml:space="preserve">fiber</w:t>
-      </w:r>
-      <w:r>
-        <w:t xml:space="preserve">,</w:t>
-      </w:r>
-      <w:r>
-        <w:t xml:space="preserve"> </w:t>
-      </w:r>
-      <w:r>
-        <w:rPr>
-          <w:rStyle w:val="VerbatimChar"/>
-        </w:rPr>
-        <w:t xml:space="preserve">carbo</w:t>
-      </w:r>
-      <w:r>
-        <w:t xml:space="preserve">,</w:t>
-      </w:r>
-      <w:r>
-        <w:t xml:space="preserve"> </w:t>
-      </w:r>
-      <w:r>
-        <w:rPr>
-          <w:rStyle w:val="VerbatimChar"/>
-        </w:rPr>
-        <w:t xml:space="preserve">sugars</w:t>
-      </w:r>
-      <w:r>
-        <w:t xml:space="preserve">,</w:t>
-      </w:r>
-      <w:r>
-        <w:t xml:space="preserve"> </w:t>
-      </w:r>
-      <w:r>
-        <w:rPr>
-          <w:rStyle w:val="VerbatimChar"/>
-        </w:rPr>
-        <w:t xml:space="preserve">potass</w:t>
-      </w:r>
-      <w:r>
-        <w:t xml:space="preserve">: the amount of each of these nutrients, per gram, per serving (sodium and potassium are measured in milligrams)</w:t>
-      </w:r>
-    </w:p>
-    <w:p>
-      <w:pPr>
-        <w:numPr>
-          <w:ilvl w:val="0"/>
-          <w:numId w:val="1005"/>
-        </w:numPr>
-      </w:pPr>
-      <w:r>
-        <w:rPr>
-          <w:rStyle w:val="VerbatimChar"/>
-        </w:rPr>
-        <w:t xml:space="preserve">shelf</w:t>
-      </w:r>
-      <w:r>
-        <w:t xml:space="preserve">: where the cereal was physically located (cereals on low aisles may be targeted toward children, for instance).</w:t>
-      </w:r>
-    </w:p>
-    <w:p>
-      <w:pPr>
-        <w:pStyle w:val="FirstParagraph"/>
-      </w:pPr>
-      <w:r>
-        <w:t xml:space="preserve">For the purposes of this homework, you may assume that this is a random sample of cereal types. Download</w:t>
-      </w:r>
-      <w:r>
-        <w:t xml:space="preserve"> </w:t>
-      </w:r>
-      <w:r>
-        <w:rPr>
-          <w:rStyle w:val="VerbatimChar"/>
-        </w:rPr>
-        <w:t xml:space="preserve">cereal.csv</w:t>
-      </w:r>
-      <w:r>
-        <w:t xml:space="preserve"> </w:t>
-      </w:r>
-      <w:r>
-        <w:t xml:space="preserve">from the Canvas Assignment page. Save it in your</w:t>
-      </w:r>
-      <w:r>
-        <w:t xml:space="preserve"> </w:t>
-      </w:r>
-      <w:r>
-        <w:rPr>
-          <w:rStyle w:val="VerbatimChar"/>
-        </w:rPr>
-        <w:t xml:space="preserve">data</w:t>
-      </w:r>
-      <w:r>
-        <w:t xml:space="preserve"> </w:t>
-      </w:r>
-      <w:r>
-        <w:t xml:space="preserve">folder within your project folder. You may load the dataset with the code below: (Ensure that you suppress any warnings and messages.)</w:t>
-      </w:r>
-    </w:p>
-    <w:p>
-      <w:pPr>
-        <w:pStyle w:val="SourceCode"/>
-      </w:pPr>
-      <w:r>
-        <w:rPr>
-          <w:rStyle w:val="NormalTok"/>
-        </w:rPr>
-        <w:t xml:space="preserve">cereal </w:t>
-      </w:r>
-      <w:r>
-        <w:rPr>
-          <w:rStyle w:val="OtherTok"/>
-        </w:rPr>
-        <w:t xml:space="preserve">&lt;-</w:t>
-      </w:r>
-      <w:r>
-        <w:rPr>
-          <w:rStyle w:val="NormalTok"/>
-        </w:rPr>
-        <w:t xml:space="preserve"> </w:t>
-      </w:r>
-      <w:r>
-        <w:rPr>
-          <w:rStyle w:val="FunctionTok"/>
-        </w:rPr>
-        <w:t xml:space="preserve">read.csv</w:t>
-      </w:r>
-      <w:r>
-        <w:rPr>
-          <w:rStyle w:val="NormalTok"/>
-        </w:rPr>
-        <w:t xml:space="preserve">(</w:t>
-      </w:r>
-      <w:r>
-        <w:rPr>
-          <w:rStyle w:val="StringTok"/>
-        </w:rPr>
-        <w:t xml:space="preserve">"data/cereal.csv"</w:t>
-      </w:r>
-      <w:r>
-        <w:rPr>
-          <w:rStyle w:val="NormalTok"/>
-        </w:rPr>
-        <w:t xml:space="preserve">)</w:t>
-      </w:r>
-    </w:p>
-    <w:bookmarkEnd w:id="15"/>
-    <w:bookmarkStart w:id="16" w:name="exercise-3"/>
-    <w:p>
-      <w:pPr>
-        <w:pStyle w:val="Heading2"/>
-      </w:pPr>
-      <w:r>
-        <w:t xml:space="preserve">Exercise 3</w:t>
-      </w:r>
-    </w:p>
-    <w:p>
-      <w:pPr>
-        <w:pStyle w:val="FirstParagraph"/>
-      </w:pPr>
-      <w:r>
-        <w:t xml:space="preserve">For this exercise, we’ll be investigating the research question: Is there evidence that there is a relationship between cereal manufacturer and where on the shelf their cereals are placed?</w:t>
-      </w:r>
-    </w:p>
-    <w:p>
-      <w:pPr>
-        <w:pStyle w:val="Compact"/>
-        <w:numPr>
-          <w:ilvl w:val="0"/>
-          <w:numId w:val="1006"/>
-        </w:numPr>
-      </w:pPr>
-      <w:r>
-        <w:t xml:space="preserve">Use the following code to print the table of cereal placement versus manufacturer. (Yes, just copy and paste the code into your document.)</w:t>
-      </w:r>
-    </w:p>
-    <w:p>
-      <w:pPr>
-        <w:pStyle w:val="SourceCode"/>
-      </w:pPr>
-      <w:r>
-        <w:rPr>
-          <w:rStyle w:val="FunctionTok"/>
-        </w:rPr>
-        <w:t xml:space="preserve">table</w:t>
-      </w:r>
-      <w:r>
-        <w:rPr>
-          <w:rStyle w:val="NormalTok"/>
-        </w:rPr>
-        <w:t xml:space="preserve">(cereal</w:t>
-      </w:r>
-      <w:r>
-        <w:rPr>
-          <w:rStyle w:val="SpecialCharTok"/>
-        </w:rPr>
-        <w:t xml:space="preserve">$</w:t>
-      </w:r>
-      <w:r>
-        <w:rPr>
-          <w:rStyle w:val="NormalTok"/>
-        </w:rPr>
-        <w:t xml:space="preserve">shelf, cereal</w:t>
-      </w:r>
-      <w:r>
-        <w:rPr>
-          <w:rStyle w:val="SpecialCharTok"/>
-        </w:rPr>
-        <w:t xml:space="preserve">$</w:t>
-      </w:r>
-      <w:r>
-        <w:rPr>
-          <w:rStyle w:val="NormalTok"/>
-        </w:rPr>
-        <w:t xml:space="preserve">mfr)</w:t>
-      </w:r>
-    </w:p>
-    <w:p>
-      <w:pPr>
-        <w:pStyle w:val="FirstParagraph"/>
-      </w:pPr>
-      <w:r>
-        <w:t xml:space="preserve">In general, are cell counts lower or higher compared to ideal counts for a Chi-Square test?</w:t>
-      </w:r>
-    </w:p>
-    <w:p>
-      <w:pPr>
-        <w:numPr>
-          <w:ilvl w:val="0"/>
-          <w:numId w:val="1007"/>
-        </w:numPr>
-      </w:pPr>
-      <w:r>
-        <w:t xml:space="preserve">You decide to conduct a Fisher’s Exact Test. State the null and alternative hypotheses in words.</w:t>
-      </w:r>
-    </w:p>
-    <w:p>
-      <w:pPr>
-        <w:numPr>
-          <w:ilvl w:val="0"/>
-          <w:numId w:val="1007"/>
-        </w:numPr>
-      </w:pPr>
-      <w:r>
-        <w:t xml:space="preserve">Use R to conduct the test, displaying the code and output. Use</w:t>
-      </w:r>
-      <w:r>
-        <w:t xml:space="preserve"> </w:t>
-      </w:r>
-      <m:oMath>
-        <m:r>
-          <m:t>α</m:t>
-        </m:r>
-        <m:r>
-          <m:rPr>
-            <m:sty m:val="p"/>
-          </m:rPr>
-          <m:t>=</m:t>
-        </m:r>
-        <m:r>
-          <m:t>0.05</m:t>
-        </m:r>
-      </m:oMath>
-      <w:r>
-        <w:t xml:space="preserve"> </w:t>
-      </w:r>
-      <w:r>
-        <w:t xml:space="preserve">To conduct this test, simply use</w:t>
-      </w:r>
-      <w:r>
-        <w:t xml:space="preserve"> </w:t>
-      </w:r>
-      <w:r>
-        <w:rPr>
-          <w:rStyle w:val="VerbatimChar"/>
-        </w:rPr>
-        <w:t xml:space="preserve">fisher.test(_____)</w:t>
-      </w:r>
-      <w:r>
-        <w:t xml:space="preserve">, and fill in the blank with the table code from part 4 (a).</w:t>
-      </w:r>
-    </w:p>
-    <w:p>
-      <w:pPr>
-        <w:numPr>
-          <w:ilvl w:val="0"/>
-          <w:numId w:val="1007"/>
-        </w:numPr>
-      </w:pPr>
-      <w:r>
-        <w:t xml:space="preserve">State your p-value, whether you reject or fail to reject the null hypothesis, and state your conclusion.</w:t>
+        <w:t xml:space="preserve">Select the first page of your .PDF submission to be associated with the</w:t>
+      </w:r>
+      <w:r>
+        <w:t xml:space="preserve"> </w:t>
+      </w:r>
+      <w:r>
+        <w:t xml:space="preserve">“Formatting”</w:t>
+      </w:r>
+      <w:r>
+        <w:t xml:space="preserve"> </w:t>
+      </w:r>
+      <w:r>
+        <w:t xml:space="preserve">section.</w:t>
       </w:r>
     </w:p>
     <w:bookmarkEnd w:id="16"/>
-    <w:bookmarkStart w:id="17" w:name="ai-attestation"/>
-    <w:p>
-      <w:pPr>
-        <w:pStyle w:val="Heading2"/>
-      </w:pPr>
-      <w:r>
-        <w:t xml:space="preserve">AI Attestation</w:t>
-      </w:r>
-    </w:p>
-    <w:p>
-      <w:pPr>
-        <w:pStyle w:val="FirstParagraph"/>
-      </w:pPr>
-      <w:r>
-        <w:t xml:space="preserve">Was AI used on this assignment? If so, describe your prompts below. If not, simply state</w:t>
-      </w:r>
-      <w:r>
-        <w:t xml:space="preserve"> </w:t>
-      </w:r>
-      <w:r>
-        <w:t xml:space="preserve">“AI was not used on this assignment.”</w:t>
-      </w:r>
-    </w:p>
-    <w:bookmarkEnd w:id="17"/>
-    <w:bookmarkStart w:id="18" w:name="submission"/>
-    <w:p>
-      <w:pPr>
-        <w:pStyle w:val="Heading2"/>
-      </w:pPr>
-      <w:r>
-        <w:t xml:space="preserve">Submission</w:t>
-      </w:r>
-    </w:p>
-    <w:p>
-      <w:pPr>
-        <w:pStyle w:val="FirstParagraph"/>
-      </w:pPr>
-      <w:r>
-        <w:t xml:space="preserve">As you’ve seen previously, we can</w:t>
-      </w:r>
-      <w:r>
-        <w:t xml:space="preserve"> </w:t>
-      </w:r>
-      <w:r>
-        <w:rPr>
-          <w:b/>
-          <w:bCs/>
-        </w:rPr>
-        <w:t xml:space="preserve">Render</w:t>
-      </w:r>
-      <w:r>
-        <w:t xml:space="preserve"> </w:t>
-      </w:r>
-      <w:r>
-        <w:t xml:space="preserve">into an .html file that can be opened by any web browser. To export it as a .pdf, open the file in your web browser and then print to or save as a .pdf document. Contact me in Ed Discussion if you need help!</w:t>
-      </w:r>
-    </w:p>
-    <w:p>
-      <w:pPr>
-        <w:pStyle w:val="BodyText"/>
-      </w:pPr>
-      <w:r>
-        <w:t xml:space="preserve">You will submit the PDF documents for labs and homework to Gradescope as part of your final submission.</w:t>
-      </w:r>
-    </w:p>
-    <w:p>
-      <w:pPr>
-        <w:pStyle w:val="BodyText"/>
-      </w:pPr>
-      <w:r>
-        <w:t xml:space="preserve">To submit your assignment:</w:t>
-      </w:r>
-    </w:p>
-    <w:p>
-      <w:pPr>
-        <w:numPr>
-          <w:ilvl w:val="0"/>
-          <w:numId w:val="1008"/>
-        </w:numPr>
-      </w:pPr>
-      <w:r>
-        <w:t xml:space="preserve">Access Gradescope through the menu on the BIOS 600 Canvas site.</w:t>
-      </w:r>
-    </w:p>
-    <w:p>
-      <w:pPr>
-        <w:numPr>
-          <w:ilvl w:val="0"/>
-          <w:numId w:val="1008"/>
-        </w:numPr>
-      </w:pPr>
-      <w:r>
-        <w:t xml:space="preserve">Click on the assignment, and you’ll be prompted to submit it.</w:t>
-      </w:r>
-    </w:p>
-    <w:p>
-      <w:pPr>
-        <w:numPr>
-          <w:ilvl w:val="0"/>
-          <w:numId w:val="1008"/>
-        </w:numPr>
-      </w:pPr>
-      <w:r>
-        <w:t xml:space="preserve">Mark the pages associated with each exercise. All of the pages of your lab should be associated with at least one question (i.e., should be “checked”).</w:t>
-      </w:r>
-    </w:p>
-    <w:p>
-      <w:pPr>
-        <w:numPr>
-          <w:ilvl w:val="0"/>
-          <w:numId w:val="1008"/>
-        </w:numPr>
-      </w:pPr>
-      <w:r>
-        <w:t xml:space="preserve">Select the first page of your .PDF submission to be associated with the</w:t>
-      </w:r>
-      <w:r>
-        <w:t xml:space="preserve"> </w:t>
-      </w:r>
-      <w:r>
-        <w:t xml:space="preserve">“Formatting”</w:t>
-      </w:r>
-      <w:r>
-        <w:t xml:space="preserve"> </w:t>
-      </w:r>
-      <w:r>
-        <w:t xml:space="preserve">section.</w:t>
-      </w:r>
-    </w:p>
-    <w:bookmarkEnd w:id="18"/>
-    <w:bookmarkStart w:id="19" w:name="grading"/>
+    <w:bookmarkStart w:id="17" w:name="grading"/>
     <w:p>
       <w:pPr>
         <w:pStyle w:val="Heading2"/>
@@ -1382,7 +953,7 @@
               <w:pStyle w:val="Compact"/>
             </w:pPr>
             <w:r>
-              <w:t xml:space="preserve">8</w:t>
+              <w:t xml:space="preserve">7</w:t>
             </w:r>
           </w:p>
         </w:tc>
@@ -1407,30 +978,6 @@
             </w:pPr>
             <w:r>
               <w:t xml:space="preserve">1</w:t>
-            </w:r>
-          </w:p>
-        </w:tc>
-      </w:tr>
-      <w:tr>
-        <w:tc>
-          <w:tcPr/>
-          <w:p>
-            <w:pPr>
-              <w:pStyle w:val="Compact"/>
-            </w:pPr>
-            <w:r>
-              <w:t xml:space="preserve">Ex 3</w:t>
-            </w:r>
-          </w:p>
-        </w:tc>
-        <w:tc>
-          <w:tcPr/>
-          <w:p>
-            <w:pPr>
-              <w:pStyle w:val="Compact"/>
-            </w:pPr>
-            <w:r>
-              <w:t xml:space="preserve">3</w:t>
             </w:r>
           </w:p>
         </w:tc>
@@ -1492,7 +1039,7 @@
         <w:t xml:space="preserve">The “Formatting” grade is to assess the document format. This includes having a neatly organized document (no excessive output, warnings/messages when loading packages and/or data) with readable code and your name and the date updated in the YAML.</w:t>
       </w:r>
     </w:p>
-    <w:bookmarkEnd w:id="19"/>
+    <w:bookmarkEnd w:id="17"/>
     <w:sectPr>
       <w:footnotePr>
         <w:numRestart w:val="eachSect"/>
@@ -1954,91 +1501,6 @@
     <w:lvl w:ilvl="8">
       <w:start w:val="1"/>
       <w:numFmt w:val="lowerRoman"/>
-      <w:lvlText w:val="%9."/>
-      <w:lvlJc w:val="left"/>
-      <w:pPr>
-        <w:ind w:left="6480" w:hanging="360"/>
-      </w:pPr>
-    </w:lvl>
-  </w:abstractNum>
-  <w:abstractNum w:abstractNumId="99712">
-    <w:nsid w:val="00A99712"/>
-    <w:multiLevelType w:val="multilevel"/>
-    <w:lvl w:ilvl="0">
-      <w:start w:val="2"/>
-      <w:numFmt w:val="lowerLetter"/>
-      <w:lvlText w:val="%1."/>
-      <w:lvlJc w:val="left"/>
-      <w:pPr>
-        <w:ind w:left="720" w:hanging="360"/>
-      </w:pPr>
-    </w:lvl>
-    <w:lvl w:ilvl="1">
-      <w:start w:val="2"/>
-      <w:numFmt w:val="lowerLetter"/>
-      <w:lvlText w:val="%2."/>
-      <w:lvlJc w:val="left"/>
-      <w:pPr>
-        <w:ind w:left="1440" w:hanging="360"/>
-      </w:pPr>
-    </w:lvl>
-    <w:lvl w:ilvl="2">
-      <w:start w:val="2"/>
-      <w:numFmt w:val="lowerLetter"/>
-      <w:lvlText w:val="%3."/>
-      <w:lvlJc w:val="left"/>
-      <w:pPr>
-        <w:ind w:left="2160" w:hanging="360"/>
-      </w:pPr>
-    </w:lvl>
-    <w:lvl w:ilvl="3">
-      <w:start w:val="2"/>
-      <w:numFmt w:val="lowerLetter"/>
-      <w:lvlText w:val="%4."/>
-      <w:lvlJc w:val="left"/>
-      <w:pPr>
-        <w:ind w:left="2880" w:hanging="360"/>
-      </w:pPr>
-    </w:lvl>
-    <w:lvl w:ilvl="4">
-      <w:start w:val="2"/>
-      <w:numFmt w:val="lowerLetter"/>
-      <w:lvlText w:val="%5."/>
-      <w:lvlJc w:val="left"/>
-      <w:pPr>
-        <w:ind w:left="3600" w:hanging="360"/>
-      </w:pPr>
-    </w:lvl>
-    <w:lvl w:ilvl="5">
-      <w:start w:val="2"/>
-      <w:numFmt w:val="lowerLetter"/>
-      <w:lvlText w:val="%6."/>
-      <w:lvlJc w:val="left"/>
-      <w:pPr>
-        <w:ind w:left="4320" w:hanging="360"/>
-      </w:pPr>
-    </w:lvl>
-    <w:lvl w:ilvl="6">
-      <w:start w:val="2"/>
-      <w:numFmt w:val="lowerLetter"/>
-      <w:lvlText w:val="%7."/>
-      <w:lvlJc w:val="left"/>
-      <w:pPr>
-        <w:ind w:left="5040" w:hanging="360"/>
-      </w:pPr>
-    </w:lvl>
-    <w:lvl w:ilvl="7">
-      <w:start w:val="2"/>
-      <w:numFmt w:val="lowerLetter"/>
-      <w:lvlText w:val="%8."/>
-      <w:lvlJc w:val="left"/>
-      <w:pPr>
-        <w:ind w:left="5760" w:hanging="360"/>
-      </w:pPr>
-    </w:lvl>
-    <w:lvl w:ilvl="8">
-      <w:start w:val="2"/>
-      <w:numFmt w:val="lowerLetter"/>
       <w:lvlText w:val="%9."/>
       <w:lvlJc w:val="left"/>
       <w:pPr>
@@ -2143,69 +1605,6 @@
     </w:lvlOverride>
   </w:num>
   <w:num w:numId="1005">
-    <w:abstractNumId w:val="991"/>
-  </w:num>
-  <w:num w:numId="1006">
-    <w:abstractNumId w:val="99711"/>
-    <w:lvlOverride w:ilvl="0">
-      <w:startOverride w:val="1"/>
-    </w:lvlOverride>
-    <w:lvlOverride w:ilvl="1">
-      <w:startOverride w:val="1"/>
-    </w:lvlOverride>
-    <w:lvlOverride w:ilvl="2">
-      <w:startOverride w:val="1"/>
-    </w:lvlOverride>
-    <w:lvlOverride w:ilvl="3">
-      <w:startOverride w:val="1"/>
-    </w:lvlOverride>
-    <w:lvlOverride w:ilvl="4">
-      <w:startOverride w:val="1"/>
-    </w:lvlOverride>
-    <w:lvlOverride w:ilvl="5">
-      <w:startOverride w:val="1"/>
-    </w:lvlOverride>
-    <w:lvlOverride w:ilvl="6">
-      <w:startOverride w:val="1"/>
-    </w:lvlOverride>
-    <w:lvlOverride w:ilvl="7">
-      <w:startOverride w:val="1"/>
-    </w:lvlOverride>
-    <w:lvlOverride w:ilvl="8">
-      <w:startOverride w:val="1"/>
-    </w:lvlOverride>
-  </w:num>
-  <w:num w:numId="1007">
-    <w:abstractNumId w:val="99712"/>
-    <w:lvlOverride w:ilvl="0">
-      <w:startOverride w:val="2"/>
-    </w:lvlOverride>
-    <w:lvlOverride w:ilvl="1">
-      <w:startOverride w:val="2"/>
-    </w:lvlOverride>
-    <w:lvlOverride w:ilvl="2">
-      <w:startOverride w:val="2"/>
-    </w:lvlOverride>
-    <w:lvlOverride w:ilvl="3">
-      <w:startOverride w:val="2"/>
-    </w:lvlOverride>
-    <w:lvlOverride w:ilvl="4">
-      <w:startOverride w:val="2"/>
-    </w:lvlOverride>
-    <w:lvlOverride w:ilvl="5">
-      <w:startOverride w:val="2"/>
-    </w:lvlOverride>
-    <w:lvlOverride w:ilvl="6">
-      <w:startOverride w:val="2"/>
-    </w:lvlOverride>
-    <w:lvlOverride w:ilvl="7">
-      <w:startOverride w:val="2"/>
-    </w:lvlOverride>
-    <w:lvlOverride w:ilvl="8">
-      <w:startOverride w:val="2"/>
-    </w:lvlOverride>
-  </w:num>
-  <w:num w:numId="1008">
     <w:abstractNumId w:val="991"/>
   </w:num>
 </w:numbering>

</xml_diff>